<commit_message>
add education + small edits
</commit_message>
<xml_diff>
--- a/LexVar.docx
+++ b/LexVar.docx
@@ -614,7 +614,7 @@
           <w:rPr>
             <w:rStyle w:val="Hyperlink"/>
           </w:rPr>
-          <w:t xml:space="preserve">C. E. Laing, 2017</w:t>
+          <w:t xml:space="preserve">Laing, 2017</w:t>
         </w:r>
       </w:hyperlink>
       <w:r>
@@ -861,7 +861,7 @@
         </w:r>
       </w:hyperlink>
       <w:r>
-        <w:t xml:space="preserve">; but see also</w:t>
+        <w:t xml:space="preserve">; see also</w:t>
       </w:r>
       <w:r>
         <w:t xml:space="preserve"> </w:t>
@@ -921,7 +921,7 @@
         <w:t xml:space="preserve"> </w:t>
       </w:r>
       <w:r>
-        <w:t xml:space="preserve">(one of the best predictors of earlier word learning,</w:t>
+        <w:t xml:space="preserve">(one of the best predictors of earlier word learning:</w:t>
       </w:r>
       <w:r>
         <w:t xml:space="preserve"> </w:t>
@@ -947,7 +947,7 @@
         <w:t xml:space="preserve"> </w:t>
       </w:r>
       <w:r>
-        <w:t xml:space="preserve">(and thus potentially harder to learn new words from, e.g.,</w:t>
+        <w:t xml:space="preserve">(and thus potentially harder to learn new words from: e.g.,</w:t>
       </w:r>
       <w:r>
         <w:t xml:space="preserve"> </w:t>
@@ -1672,23 +1672,7 @@
         <w:pStyle w:val="FirstParagraph"/>
       </w:pPr>
       <w:r>
-        <w:t xml:space="preserve">Despite competing possibilities for the effect of label variation on children’s word learning, no studies to date have directly tested how</w:t>
-      </w:r>
-      <w:r>
-        <w:t xml:space="preserve"> </w:t>
-      </w:r>
-      <w:r>
-        <w:rPr>
-          <w:i/>
-          <w:iCs/>
-        </w:rPr>
-        <w:t xml:space="preserve">consistent versus variable labels</w:t>
-      </w:r>
-      <w:r>
-        <w:t xml:space="preserve"> </w:t>
-      </w:r>
-      <w:r>
-        <w:t xml:space="preserve">impact children’s ability to learn new words. The present study addresses this gap by manipulating the presence and type of label variation in a controlled, lab-based novel word learning task. In an eye-tracking study using a looking-while-listening (LWL) design</w:t>
+        <w:t xml:space="preserve">Despite competing possibilities for the effect of label variation on children’s word learning, no studies to date have directly tested how consistent versus variable labels impact children’s ability to learn new words. The present study addresses this gap by manipulating the presence and type of label variation in a controlled, lab-based novel word learning task. In an eye-tracking study using a looking-while-listening (LWL) design</w:t>
       </w:r>
       <w:r>
         <w:t xml:space="preserve"> </w:t>
@@ -1770,7 +1754,41 @@
         <w:t xml:space="preserve"> </w:t>
       </w:r>
       <w:r>
-        <w:t xml:space="preserve">condition featured phonologically altered word forms that are unattested in English CDS. Looking-time measures were used to assess children’s word-recognition accuracy, and pupil size synchrony measures</w:t>
+        <w:t xml:space="preserve">condition featured phonologically altered word forms that are unattested in English CDS. Looking-time measures were used to assess children’s word-recognition accuracy</w:t>
+      </w:r>
+      <w:r>
+        <w:t xml:space="preserve"> </w:t>
+      </w:r>
+      <w:r>
+        <w:t xml:space="preserve">(</w:t>
+      </w:r>
+      <w:hyperlink w:anchor="ref-fernald2008looking">
+        <w:r>
+          <w:rPr>
+            <w:rStyle w:val="Hyperlink"/>
+          </w:rPr>
+          <w:t xml:space="preserve">Fernald et al., 2008</w:t>
+        </w:r>
+      </w:hyperlink>
+      <w:r>
+        <w:t xml:space="preserve">;</w:t>
+      </w:r>
+      <w:r>
+        <w:t xml:space="preserve"> </w:t>
+      </w:r>
+      <w:hyperlink w:anchor="ref-swingley2011looking">
+        <w:r>
+          <w:rPr>
+            <w:rStyle w:val="Hyperlink"/>
+          </w:rPr>
+          <w:t xml:space="preserve">Swingley, 2011</w:t>
+        </w:r>
+      </w:hyperlink>
+      <w:r>
+        <w:t xml:space="preserve">)</w:t>
+      </w:r>
+      <w:r>
+        <w:t xml:space="preserve">, and pupil size synchrony measures</w:t>
       </w:r>
       <w:r>
         <w:t xml:space="preserve"> </w:t>
@@ -1828,8 +1846,8 @@
       </w:r>
       <w:r>
         <w:rPr>
-          <w:i/>
-          <w:iCs/>
+          <w:b/>
+          <w:bCs/>
         </w:rPr>
         <w:t xml:space="preserve">consistent</w:t>
       </w:r>
@@ -1855,8 +1873,8 @@
       </w:r>
       <w:r>
         <w:rPr>
-          <w:i/>
-          <w:iCs/>
+          <w:b/>
+          <w:bCs/>
         </w:rPr>
         <w:t xml:space="preserve">typical variation</w:t>
       </w:r>
@@ -1905,8 +1923,8 @@
       </w:r>
       <w:r>
         <w:rPr>
-          <w:i/>
-          <w:iCs/>
+          <w:b/>
+          <w:bCs/>
         </w:rPr>
         <w:t xml:space="preserve">atypical variation</w:t>
       </w:r>
@@ -2033,7 +2051,7 @@
         <w:t xml:space="preserve">age</w:t>
       </w:r>
       <w:r>
-        <w:t xml:space="preserve">=28.08 months), were full-term, monolingual English-hearing children (&gt;80% exposure) with no known hearing, vision, language, and/or developmental delays and were recruited from a volunteer database of local families. Caregivers reported race/ethnicity information for their children in an open-ended format. Participants were primarily Non-Latine white (</w:t>
+        <w:t xml:space="preserve">=28.08 months), were full-term, monolingual English-hearing children (&gt;80% exposure) with no known hearing, vision, language, and/or developmental delays and were recruited from a volunteer database of local families. Caregivers reported race/ethnicity information for their children in an open-ended format at the time of database sign-up. Participants were primarily Non-Latine white (</w:t>
       </w:r>
       <w:r>
         <w:rPr>
@@ -2093,7 +2111,47 @@
         <w:t xml:space="preserve">N</w:t>
       </w:r>
       <w:r>
-        <w:t xml:space="preserve">=11, 18.97%).</w:t>
+        <w:t xml:space="preserve">=11, 18.97%). Caregivers also reported maternal education, though more sparsely: High school (</w:t>
+      </w:r>
+      <w:r>
+        <w:rPr>
+          <w:i/>
+          <w:iCs/>
+        </w:rPr>
+        <w:t xml:space="preserve">N</w:t>
+      </w:r>
+      <w:r>
+        <w:t xml:space="preserve">=1, 1.72%), Bachelor’s (</w:t>
+      </w:r>
+      <w:r>
+        <w:rPr>
+          <w:i/>
+          <w:iCs/>
+        </w:rPr>
+        <w:t xml:space="preserve">N</w:t>
+      </w:r>
+      <w:r>
+        <w:t xml:space="preserve">=12, 20.69%), Master’s or higher (</w:t>
+      </w:r>
+      <w:r>
+        <w:rPr>
+          <w:i/>
+          <w:iCs/>
+        </w:rPr>
+        <w:t xml:space="preserve">N</w:t>
+      </w:r>
+      <w:r>
+        <w:t xml:space="preserve">=11, 18.97%), Not reported (</w:t>
+      </w:r>
+      <w:r>
+        <w:rPr>
+          <w:i/>
+          <w:iCs/>
+        </w:rPr>
+        <w:t xml:space="preserve">N</w:t>
+      </w:r>
+      <w:r>
+        <w:t xml:space="preserve">=34, 58.62%).</w:t>
       </w:r>
     </w:p>
     <w:p>
@@ -4241,7 +4299,7 @@
           <w:rPr>
             <w:rStyle w:val="Hyperlink"/>
           </w:rPr>
-          <w:t xml:space="preserve">C. Laing, 2019</w:t>
+          <w:t xml:space="preserve">Laing, 2019</w:t>
         </w:r>
       </w:hyperlink>
       <w:r>
@@ -5110,13 +5168,49 @@
       </w:r>
     </w:p>
     <w:bookmarkEnd w:id="77"/>
-    <w:bookmarkStart w:id="78" w:name="ref-laing2019role"/>
+    <w:bookmarkStart w:id="78" w:name="ref-laing2017perceptual"/>
     <w:p>
       <w:pPr>
         <w:pStyle w:val="Bibliography"/>
       </w:pPr>
       <w:r>
-        <w:t xml:space="preserve">Laing, C. (2019). A role for onomatopoeia in early language: Evidence from phonological development.</w:t>
+        <w:t xml:space="preserve">Laing, C. E. (2017). A perceptual advantage for onomatopoeia in early word learning: Evidence from eye-tracking.</w:t>
+      </w:r>
+      <w:r>
+        <w:t xml:space="preserve"> </w:t>
+      </w:r>
+      <w:r>
+        <w:rPr>
+          <w:i/>
+          <w:iCs/>
+        </w:rPr>
+        <w:t xml:space="preserve">Journal of Experimental Child Psychology</w:t>
+      </w:r>
+      <w:r>
+        <w:t xml:space="preserve">,</w:t>
+      </w:r>
+      <w:r>
+        <w:t xml:space="preserve"> </w:t>
+      </w:r>
+      <w:r>
+        <w:rPr>
+          <w:i/>
+          <w:iCs/>
+        </w:rPr>
+        <w:t xml:space="preserve">161</w:t>
+      </w:r>
+      <w:r>
+        <w:t xml:space="preserve">, 32–45.</w:t>
+      </w:r>
+    </w:p>
+    <w:bookmarkEnd w:id="78"/>
+    <w:bookmarkStart w:id="79" w:name="ref-laing2019role"/>
+    <w:p>
+      <w:pPr>
+        <w:pStyle w:val="Bibliography"/>
+      </w:pPr>
+      <w:r>
+        <w:t xml:space="preserve">Laing, C. E. (2019). A role for onomatopoeia in early language: Evidence from phonological development.</w:t>
       </w:r>
       <w:r>
         <w:t xml:space="preserve"> </w:t>
@@ -5143,42 +5237,6 @@
       </w:r>
       <w:r>
         <w:t xml:space="preserve">(2), 173–187.</w:t>
-      </w:r>
-    </w:p>
-    <w:bookmarkEnd w:id="78"/>
-    <w:bookmarkStart w:id="79" w:name="ref-laing2017perceptual"/>
-    <w:p>
-      <w:pPr>
-        <w:pStyle w:val="Bibliography"/>
-      </w:pPr>
-      <w:r>
-        <w:t xml:space="preserve">Laing, C. E. (2017). A perceptual advantage for onomatopoeia in early word learning: Evidence from eye-tracking.</w:t>
-      </w:r>
-      <w:r>
-        <w:t xml:space="preserve"> </w:t>
-      </w:r>
-      <w:r>
-        <w:rPr>
-          <w:i/>
-          <w:iCs/>
-        </w:rPr>
-        <w:t xml:space="preserve">Journal of Experimental Child Psychology</w:t>
-      </w:r>
-      <w:r>
-        <w:t xml:space="preserve">,</w:t>
-      </w:r>
-      <w:r>
-        <w:t xml:space="preserve"> </w:t>
-      </w:r>
-      <w:r>
-        <w:rPr>
-          <w:i/>
-          <w:iCs/>
-        </w:rPr>
-        <w:t xml:space="preserve">161</w:t>
-      </w:r>
-      <w:r>
-        <w:t xml:space="preserve">, 32–45.</w:t>
       </w:r>
     </w:p>
     <w:bookmarkEnd w:id="79"/>

</xml_diff>

<commit_message>
add osf link + small edits
</commit_message>
<xml_diff>
--- a/LexVar.docx
+++ b/LexVar.docx
@@ -89,7 +89,7 @@
           <w:noProof/>
         </w:rPr>
         <w:drawing>
-          <wp:inline distT="0" distB="0" distL="0" distR="0" wp14:anchorId="6FE9BC8C" wp14:editId="74F33A79">
+          <wp:inline distT="0" distB="0" distL="0" distR="0" wp14:anchorId="22DFAC0A" wp14:editId="79D7BA0B">
             <wp:extent cx="152279" cy="152279"/>
             <wp:effectExtent l="0" t="0" r="0" b="0"/>
             <wp:docPr id="22" name="Picture" descr="Orcid ID Logo: A green circle with white letters ID"/>
@@ -164,7 +164,7 @@
           <w:noProof/>
         </w:rPr>
         <w:drawing>
-          <wp:inline distT="0" distB="0" distL="0" distR="0" wp14:anchorId="3217184A" wp14:editId="3B0B8AC0">
+          <wp:inline distT="0" distB="0" distL="0" distR="0" wp14:anchorId="640943F6" wp14:editId="528119E5">
             <wp:extent cx="152279" cy="152279"/>
             <wp:effectExtent l="0" t="0" r="0" b="0"/>
             <wp:docPr id="26" name="Picture" descr="Orcid ID Logo: A green circle with white letters ID"/>
@@ -243,7 +243,42 @@
         </w:r>
       </w:hyperlink>
       <w:r>
-        <w:t>). Anonymized data and fully reproducible manuscript code are available at LINK. The authors declare no conflicts of interest. This research was supported by the Eunice Kennedy Shriver National Institute of Child Health and Human Development (R01R01HD095912-05 awarded to CLW) and the National Science Foundation (Graduate Research Fellowship awarded to KC). We are grateful to the participating families as well as the members of the Princeton Baby Lab and Psychology of Language Lab for their feedback on this work.</w:t>
+        <w:t xml:space="preserve">). Anonymized data and fully reproducible manuscript code are available at </w:t>
+      </w:r>
+      <w:hyperlink r:id="rId12">
+        <w:r>
+          <w:rPr>
+            <w:rStyle w:val="Hyperlink"/>
+          </w:rPr>
+          <w:t>https://o</w:t>
+        </w:r>
+        <w:r>
+          <w:rPr>
+            <w:rStyle w:val="Hyperlink"/>
+          </w:rPr>
+          <w:t>s</w:t>
+        </w:r>
+        <w:r>
+          <w:rPr>
+            <w:rStyle w:val="Hyperlink"/>
+          </w:rPr>
+          <w:t>f.</w:t>
+        </w:r>
+        <w:r>
+          <w:rPr>
+            <w:rStyle w:val="Hyperlink"/>
+          </w:rPr>
+          <w:t>i</w:t>
+        </w:r>
+        <w:r>
+          <w:rPr>
+            <w:rStyle w:val="Hyperlink"/>
+          </w:rPr>
+          <w:t>o/xmkna</w:t>
+        </w:r>
+      </w:hyperlink>
+      <w:r>
+        <w:t>. The authors declare no conflicts of interest. This research was supported by the Eunice Kennedy Shriver National Institute of Child Health and Human Development (R01R01HD095912-05 awarded to CLW) and the National Science Foundation (Graduate Research Fellowship awarded to KC). We are grateful to the participating families as well as the members of the Princeton Baby Lab and Psychology of Language Lab for their feedback on this work.</w:t>
       </w:r>
     </w:p>
     <w:p>
@@ -253,7 +288,7 @@
       <w:r>
         <w:t xml:space="preserve">Correspondence concerning this article should be addressed to Kennedy Casey, Department of Psychology, Princeton University, 40 Woodlands Way, Princeton, NJ 08544, Email: </w:t>
       </w:r>
-      <w:hyperlink r:id="rId12">
+      <w:hyperlink r:id="rId13">
         <w:r>
           <w:rPr>
             <w:rStyle w:val="Hyperlink"/>
@@ -640,10 +675,7 @@
         </w:r>
       </w:hyperlink>
       <w:r>
-        <w:t>;</w:t>
-      </w:r>
-      <w:r>
-        <w:t xml:space="preserve"> </w:t>
+        <w:t xml:space="preserve">; </w:t>
       </w:r>
       <w:hyperlink w:anchor="ref-markman1988children">
         <w:r>
@@ -1399,7 +1431,7 @@
       <w:r>
         <w:t>Our study design and analysis plan were pre-registered (</w:t>
       </w:r>
-      <w:hyperlink r:id="rId13">
+      <w:hyperlink r:id="rId14">
         <w:r>
           <w:rPr>
             <w:rStyle w:val="Hyperlink"/>
@@ -2725,356 +2757,16 @@
         </w:rPr>
         <w:lastRenderedPageBreak/>
         <w:drawing>
-          <wp:inline distT="0" distB="0" distL="0" distR="0" wp14:anchorId="44D6C69C" wp14:editId="7E8E26DC">
+          <wp:inline distT="0" distB="0" distL="0" distR="0" wp14:anchorId="3DCB44C0" wp14:editId="3A195C6E">
             <wp:extent cx="5943600" cy="3714749"/>
             <wp:effectExtent l="0" t="0" r="0" b="0"/>
-            <wp:docPr id="49" name="Picture" descr="Figure 1. Model-predicted overall accuracy (i.e., proportion looking to target object) across conditions. Point ranges reflect estimated marginal means with 95% confidence intervals. Jittered dots show raw means for individual participants. The dotted line at 0.50 indicates chance looking."/>
+            <wp:docPr id="50" name="Picture" descr="Figure 1. Model-predicted overall accuracy (i.e., proportion looking to target object) across conditions. Point ranges reflect estimated marginal means with 95% confidence intervals. Jittered dots show raw means for individual participants. The dotted line at 0.50 indicates chance looking."/>
             <wp:cNvGraphicFramePr/>
             <a:graphic xmlns:a="http://schemas.openxmlformats.org/drawingml/2006/main">
               <a:graphicData uri="http://schemas.openxmlformats.org/drawingml/2006/picture">
                 <pic:pic xmlns:pic="http://schemas.openxmlformats.org/drawingml/2006/picture">
                   <pic:nvPicPr>
-                    <pic:cNvPr id="50" name="Picture" descr="Figure1.png"/>
-                    <pic:cNvPicPr>
-                      <a:picLocks noChangeAspect="1" noChangeArrowheads="1"/>
-                    </pic:cNvPicPr>
-                  </pic:nvPicPr>
-                  <pic:blipFill>
-                    <a:blip r:embed="rId14"/>
-                    <a:stretch>
-                      <a:fillRect/>
-                    </a:stretch>
-                  </pic:blipFill>
-                  <pic:spPr bwMode="auto">
-                    <a:xfrm>
-                      <a:off x="0" y="0"/>
-                      <a:ext cx="5943600" cy="3714749"/>
-                    </a:xfrm>
-                    <a:prstGeom prst="rect">
-                      <a:avLst/>
-                    </a:prstGeom>
-                    <a:noFill/>
-                    <a:ln w="9525">
-                      <a:noFill/>
-                      <a:headEnd/>
-                      <a:tailEnd/>
-                    </a:ln>
-                  </pic:spPr>
-                </pic:pic>
-              </a:graphicData>
-            </a:graphic>
-          </wp:inline>
-        </w:drawing>
-      </w:r>
-    </w:p>
-    <w:p>
-      <w:pPr>
-        <w:pStyle w:val="ImageCaption"/>
-      </w:pPr>
-      <w:r>
-        <w:t>Figure 1. Model-predicted overall accuracy (i.e., proportion looking to target object) across conditions. Point ranges reflect estimated marginal means with 95% confidence intervals. Jittered dots show raw means for individual participants. The dotted line at 0.50 indicates chance looking.</w:t>
-      </w:r>
-    </w:p>
-    <w:p>
-      <w:pPr>
-        <w:pStyle w:val="BodyText"/>
-      </w:pPr>
-      <w:r>
-        <w:t>Model parameter estimates revealed a significant positive effect of the consistent condition (</w:t>
-      </w:r>
-      <w:r>
-        <w:rPr>
-          <w:i/>
-          <w:iCs/>
-        </w:rPr>
-        <w:t>β</w:t>
-      </w:r>
-      <w:r>
-        <w:t xml:space="preserve">=0.47, </w:t>
-      </w:r>
-      <w:r>
-        <w:rPr>
-          <w:i/>
-          <w:iCs/>
-        </w:rPr>
-        <w:t>SE</w:t>
-      </w:r>
-      <w:r>
-        <w:t xml:space="preserve">=0.22, </w:t>
-      </w:r>
-      <w:r>
-        <w:rPr>
-          <w:i/>
-          <w:iCs/>
-        </w:rPr>
-        <w:t>p</w:t>
-      </w:r>
-      <w:r>
-        <w:t>=0.030), and a positive but non-significant effect of the typical variation condition (</w:t>
-      </w:r>
-      <w:r>
-        <w:rPr>
-          <w:i/>
-          <w:iCs/>
-        </w:rPr>
-        <w:t>β</w:t>
-      </w:r>
-      <w:r>
-        <w:t xml:space="preserve">=0.26, </w:t>
-      </w:r>
-      <w:r>
-        <w:rPr>
-          <w:i/>
-          <w:iCs/>
-        </w:rPr>
-        <w:t>SE</w:t>
-      </w:r>
-      <w:r>
-        <w:t xml:space="preserve">=0.21, </w:t>
-      </w:r>
-      <w:r>
-        <w:rPr>
-          <w:i/>
-          <w:iCs/>
-        </w:rPr>
-        <w:t>p</w:t>
-      </w:r>
-      <w:r>
-        <w:t>=0.231), relative to the atypical variation condition, on overall accuracy. Toddlers’ proportion looking to target also increased significantly with age, as hypothesized (</w:t>
-      </w:r>
-      <w:r>
-        <w:rPr>
-          <w:i/>
-          <w:iCs/>
-        </w:rPr>
-        <w:t>β</w:t>
-      </w:r>
-      <w:r>
-        <w:t xml:space="preserve">=0.26, </w:t>
-      </w:r>
-      <w:r>
-        <w:rPr>
-          <w:i/>
-          <w:iCs/>
-        </w:rPr>
-        <w:t>SE</w:t>
-      </w:r>
-      <w:r>
-        <w:t xml:space="preserve">=0.10, </w:t>
-      </w:r>
-      <w:r>
-        <w:rPr>
-          <w:i/>
-          <w:iCs/>
-        </w:rPr>
-        <w:t>p</w:t>
-      </w:r>
-      <w:r>
-        <w:t>=0.010).</w:t>
-      </w:r>
-    </w:p>
-    <w:p>
-      <w:pPr>
-        <w:pStyle w:val="BodyText"/>
-      </w:pPr>
-      <w:r>
-        <w:t>Exploratory analyses suggested descriptively stronger condition differences in the first post-labeling window, which is the typical window of analysis used in LWL studies to examine word recognition (</w:t>
-      </w:r>
-      <w:hyperlink w:anchor="ref-fernald2008looking">
-        <w:r>
-          <w:rPr>
-            <w:rStyle w:val="Hyperlink"/>
-          </w:rPr>
-          <w:t>Fernald et al., 2008</w:t>
-        </w:r>
-      </w:hyperlink>
-      <w:r>
-        <w:t xml:space="preserve">). In the second post-labeling window, which is less </w:t>
-      </w:r>
-      <w:r>
-        <w:lastRenderedPageBreak/>
-        <w:t xml:space="preserve">frequently implemented in LWL studies, children’s performance was reliably above chance in all conditions (all </w:t>
-      </w:r>
-      <w:r>
-        <w:rPr>
-          <w:i/>
-          <w:iCs/>
-        </w:rPr>
-        <w:t>p</w:t>
-      </w:r>
-      <w:r>
-        <w:t>s &lt; 0.05), indicating some evidence of learning across all types of exposure (see Supplemental Materials for further details).</w:t>
-      </w:r>
-    </w:p>
-    <w:p>
-      <w:pPr>
-        <w:pStyle w:val="Heading2"/>
-      </w:pPr>
-      <w:bookmarkStart w:id="18" w:name="X766ac349de9df7b6c7c4b96c9a4fd67a2087b79"/>
-      <w:bookmarkEnd w:id="17"/>
-      <w:r>
-        <w:t>3.2 Moment-by-moment attention measured by pupil size synchrony</w:t>
-      </w:r>
-    </w:p>
-    <w:p>
-      <w:pPr>
-        <w:pStyle w:val="FirstParagraph"/>
-      </w:pPr>
-      <w:r>
-        <w:t>Following Nencheva et al. (</w:t>
-      </w:r>
-      <w:hyperlink w:anchor="ref-nencheva2021moment">
-        <w:r>
-          <w:rPr>
-            <w:rStyle w:val="Hyperlink"/>
-          </w:rPr>
-          <w:t>2021</w:t>
-        </w:r>
-      </w:hyperlink>
-      <w:r>
-        <w:t xml:space="preserve">), we used dynamic time-warping distance (DTW, </w:t>
-      </w:r>
-      <w:hyperlink w:anchor="ref-tormene2009matching">
-        <w:r>
-          <w:rPr>
-            <w:rStyle w:val="Hyperlink"/>
-          </w:rPr>
-          <w:t>Tormene et al., 2009</w:t>
-        </w:r>
-      </w:hyperlink>
-      <w:r>
-        <w:t>) to quantify the temporal alignment of participants’ pupil responses when hearing individual exposure sentences (normalized for duration). This DTW measure quantifies the dissimilarity between two time series of pupil fluctuations. To transform these values into synchrony scores, we subtracted DTW distance scores from the maximum distance between two participants on each trial. This transformation rescales DTW distances such that higher values reflect greater synchrony. To compare synchrony across conditions, we computed pairwise synchrony scores for all possible pairs of participants (for each exposure sentence per condition).</w:t>
-      </w:r>
-    </w:p>
-    <w:p>
-      <w:pPr>
-        <w:pStyle w:val="BodyText"/>
-      </w:pPr>
-      <w:r>
-        <w:t>We examined synchrony during the two types of critical exposure sentences that differed between conditions (see also Supplementary Materials for word-level effects and analyses for all exposure sentences). A linear mixed-effects model (</w:t>
-      </w:r>
-      <w:hyperlink w:anchor="ref-lme4">
-        <w:r>
-          <w:rPr>
-            <w:rStyle w:val="Hyperlink"/>
-          </w:rPr>
-          <w:t>Bates et al., 2015</w:t>
-        </w:r>
-      </w:hyperlink>
-      <w:r>
-        <w:t>) predicting average pupil size synchrony (</w:t>
-      </w:r>
-      <w:r>
-        <w:rPr>
-          <w:i/>
-          <w:iCs/>
-        </w:rPr>
-        <w:t>z</w:t>
-      </w:r>
-      <w:r>
-        <w:t>-scored) from condition, with a by-participant random intercept, revealed a significant main effect of condition on pupil size synchrony [</w:t>
-      </w:r>
-      <w:r>
-        <w:rPr>
-          <w:i/>
-          <w:iCs/>
-        </w:rPr>
-        <w:t>F</w:t>
-      </w:r>
-      <w:r>
-        <w:t xml:space="preserve">(2, 246)=26.66, </w:t>
-      </w:r>
-      <w:r>
-        <w:rPr>
-          <w:i/>
-          <w:iCs/>
-        </w:rPr>
-        <w:t>p</w:t>
-      </w:r>
-      <w:r>
-        <w:t xml:space="preserve">&lt;0.001]. Follow-up pairwise comparisons using Tukey’s HSD correction indicated that there were statistically significant differences between all condition pairs. Pupil size synchrony was higher in the atypical variation condition (ΔM=0.20, </w:t>
-      </w:r>
-      <w:r>
-        <w:rPr>
-          <w:i/>
-          <w:iCs/>
-        </w:rPr>
-        <w:t>p</w:t>
-      </w:r>
-      <w:r>
-        <w:t xml:space="preserve">=0.006, Cohen’s </w:t>
-      </w:r>
-      <w:r>
-        <w:rPr>
-          <w:i/>
-          <w:iCs/>
-        </w:rPr>
-        <w:t>d</w:t>
-      </w:r>
-      <w:r>
-        <w:t xml:space="preserve">=0.45) and the typical variation condition (ΔM=0.47, </w:t>
-      </w:r>
-      <w:r>
-        <w:rPr>
-          <w:i/>
-          <w:iCs/>
-        </w:rPr>
-        <w:t>p</w:t>
-      </w:r>
-      <w:r>
-        <w:t xml:space="preserve">&lt;0.001, Cohen’s </w:t>
-      </w:r>
-      <w:r>
-        <w:rPr>
-          <w:i/>
-          <w:iCs/>
-        </w:rPr>
-        <w:t>d</w:t>
-      </w:r>
-      <w:r>
-        <w:t xml:space="preserve">=1.07) relative to the consistent condition. Pupil size synchrony was also higher in the typical variation condition relative to the atypical variation condition (ΔM=0.27, </w:t>
-      </w:r>
-      <w:r>
-        <w:rPr>
-          <w:i/>
-          <w:iCs/>
-        </w:rPr>
-        <w:t>p</w:t>
-      </w:r>
-      <w:r>
-        <w:t xml:space="preserve">&lt;0.001, Cohen’s </w:t>
-      </w:r>
-      <w:r>
-        <w:rPr>
-          <w:i/>
-          <w:iCs/>
-        </w:rPr>
-        <w:t>d</w:t>
-      </w:r>
-      <w:r>
-        <w:t>=0.62).</w:t>
-      </w:r>
-    </w:p>
-    <w:p>
-      <w:pPr>
-        <w:pStyle w:val="CaptionedFigure"/>
-      </w:pPr>
-      <w:r>
-        <w:rPr>
-          <w:noProof/>
-        </w:rPr>
-        <w:lastRenderedPageBreak/>
-        <w:drawing>
-          <wp:inline distT="0" distB="0" distL="0" distR="0" wp14:anchorId="2E75BE1C" wp14:editId="760AF922">
-            <wp:extent cx="5943600" cy="3714749"/>
-            <wp:effectExtent l="0" t="0" r="0" b="0"/>
-            <wp:docPr id="53" name="Picture" descr="Figure 2. Model-predicted mean pupil size synchrony (z-scored) across conditions with 95% confidence intervals. Jittered points represent participant means."/>
-            <wp:cNvGraphicFramePr/>
-            <a:graphic xmlns:a="http://schemas.openxmlformats.org/drawingml/2006/main">
-              <a:graphicData uri="http://schemas.openxmlformats.org/drawingml/2006/picture">
-                <pic:pic xmlns:pic="http://schemas.openxmlformats.org/drawingml/2006/picture">
-                  <pic:nvPicPr>
-                    <pic:cNvPr id="54" name="Picture" descr="Figure2.png"/>
+                    <pic:cNvPr id="51" name="Picture" descr="Figure1.png"/>
                     <pic:cNvPicPr>
                       <a:picLocks noChangeAspect="1" noChangeArrowheads="1"/>
                     </pic:cNvPicPr>
@@ -3112,6 +2804,346 @@
         <w:pStyle w:val="ImageCaption"/>
       </w:pPr>
       <w:r>
+        <w:t>Figure 1. Model-predicted overall accuracy (i.e., proportion looking to target object) across conditions. Point ranges reflect estimated marginal means with 95% confidence intervals. Jittered dots show raw means for individual participants. The dotted line at 0.50 indicates chance looking.</w:t>
+      </w:r>
+    </w:p>
+    <w:p>
+      <w:pPr>
+        <w:pStyle w:val="BodyText"/>
+      </w:pPr>
+      <w:r>
+        <w:t>Model parameter estimates revealed a significant positive effect of the consistent condition (</w:t>
+      </w:r>
+      <w:r>
+        <w:rPr>
+          <w:i/>
+          <w:iCs/>
+        </w:rPr>
+        <w:t>β</w:t>
+      </w:r>
+      <w:r>
+        <w:t xml:space="preserve">=0.47, </w:t>
+      </w:r>
+      <w:r>
+        <w:rPr>
+          <w:i/>
+          <w:iCs/>
+        </w:rPr>
+        <w:t>SE</w:t>
+      </w:r>
+      <w:r>
+        <w:t xml:space="preserve">=0.22, </w:t>
+      </w:r>
+      <w:r>
+        <w:rPr>
+          <w:i/>
+          <w:iCs/>
+        </w:rPr>
+        <w:t>p</w:t>
+      </w:r>
+      <w:r>
+        <w:t>=0.030), and a positive but non-significant effect of the typical variation condition (</w:t>
+      </w:r>
+      <w:r>
+        <w:rPr>
+          <w:i/>
+          <w:iCs/>
+        </w:rPr>
+        <w:t>β</w:t>
+      </w:r>
+      <w:r>
+        <w:t xml:space="preserve">=0.26, </w:t>
+      </w:r>
+      <w:r>
+        <w:rPr>
+          <w:i/>
+          <w:iCs/>
+        </w:rPr>
+        <w:t>SE</w:t>
+      </w:r>
+      <w:r>
+        <w:t xml:space="preserve">=0.21, </w:t>
+      </w:r>
+      <w:r>
+        <w:rPr>
+          <w:i/>
+          <w:iCs/>
+        </w:rPr>
+        <w:t>p</w:t>
+      </w:r>
+      <w:r>
+        <w:t>=0.231), relative to the atypical variation condition, on overall accuracy. Toddlers’ proportion looking to target also increased significantly with age, as hypothesized (</w:t>
+      </w:r>
+      <w:r>
+        <w:rPr>
+          <w:i/>
+          <w:iCs/>
+        </w:rPr>
+        <w:t>β</w:t>
+      </w:r>
+      <w:r>
+        <w:t xml:space="preserve">=0.26, </w:t>
+      </w:r>
+      <w:r>
+        <w:rPr>
+          <w:i/>
+          <w:iCs/>
+        </w:rPr>
+        <w:t>SE</w:t>
+      </w:r>
+      <w:r>
+        <w:t xml:space="preserve">=0.10, </w:t>
+      </w:r>
+      <w:r>
+        <w:rPr>
+          <w:i/>
+          <w:iCs/>
+        </w:rPr>
+        <w:t>p</w:t>
+      </w:r>
+      <w:r>
+        <w:t>=0.010).</w:t>
+      </w:r>
+    </w:p>
+    <w:p>
+      <w:pPr>
+        <w:pStyle w:val="BodyText"/>
+      </w:pPr>
+      <w:r>
+        <w:t>Exploratory analyses suggested descriptively stronger condition differences in the first post-labeling window, which is the typical window of analysis used in LWL studies to examine word recognition (</w:t>
+      </w:r>
+      <w:hyperlink w:anchor="ref-fernald2008looking">
+        <w:r>
+          <w:rPr>
+            <w:rStyle w:val="Hyperlink"/>
+          </w:rPr>
+          <w:t>Fernald et al., 2008</w:t>
+        </w:r>
+      </w:hyperlink>
+      <w:r>
+        <w:t xml:space="preserve">). In the second post-labeling window, which is less </w:t>
+      </w:r>
+      <w:r>
+        <w:lastRenderedPageBreak/>
+        <w:t xml:space="preserve">frequently implemented in LWL studies, children’s performance was reliably above chance in all conditions (all </w:t>
+      </w:r>
+      <w:r>
+        <w:rPr>
+          <w:i/>
+          <w:iCs/>
+        </w:rPr>
+        <w:t>p</w:t>
+      </w:r>
+      <w:r>
+        <w:t>s &lt; 0.05), indicating some evidence of learning across all types of exposure (see Supplemental Materials for further details).</w:t>
+      </w:r>
+    </w:p>
+    <w:p>
+      <w:pPr>
+        <w:pStyle w:val="Heading2"/>
+      </w:pPr>
+      <w:bookmarkStart w:id="18" w:name="X766ac349de9df7b6c7c4b96c9a4fd67a2087b79"/>
+      <w:bookmarkEnd w:id="17"/>
+      <w:r>
+        <w:t>3.2 Moment-by-moment attention measured by pupil size synchrony</w:t>
+      </w:r>
+    </w:p>
+    <w:p>
+      <w:pPr>
+        <w:pStyle w:val="FirstParagraph"/>
+      </w:pPr>
+      <w:r>
+        <w:t>Following Nencheva et al. (</w:t>
+      </w:r>
+      <w:hyperlink w:anchor="ref-nencheva2021moment">
+        <w:r>
+          <w:rPr>
+            <w:rStyle w:val="Hyperlink"/>
+          </w:rPr>
+          <w:t>2021</w:t>
+        </w:r>
+      </w:hyperlink>
+      <w:r>
+        <w:t xml:space="preserve">), we used dynamic time-warping distance (DTW, </w:t>
+      </w:r>
+      <w:hyperlink w:anchor="ref-tormene2009matching">
+        <w:r>
+          <w:rPr>
+            <w:rStyle w:val="Hyperlink"/>
+          </w:rPr>
+          <w:t>Tormene et al., 2009</w:t>
+        </w:r>
+      </w:hyperlink>
+      <w:r>
+        <w:t>) to quantify the temporal alignment of participants’ pupil responses when hearing individual exposure sentences (normalized for duration). This DTW measure quantifies the dissimilarity between two time series of pupil fluctuations. To transform these values into synchrony scores, we subtracted DTW distance scores from the maximum distance between two participants on each trial. This transformation rescales DTW distances such that higher values reflect greater synchrony. To compare synchrony across conditions, we computed pairwise synchrony scores for all possible pairs of participants (for each exposure sentence per condition).</w:t>
+      </w:r>
+    </w:p>
+    <w:p>
+      <w:pPr>
+        <w:pStyle w:val="BodyText"/>
+      </w:pPr>
+      <w:r>
+        <w:t>We examined synchrony during the two types of critical exposure sentences that differed between conditions (see also Supplementary Materials for word-level effects and analyses for all exposure sentences). A linear mixed-effects model (</w:t>
+      </w:r>
+      <w:hyperlink w:anchor="ref-lme4">
+        <w:r>
+          <w:rPr>
+            <w:rStyle w:val="Hyperlink"/>
+          </w:rPr>
+          <w:t>Bates et al., 2015</w:t>
+        </w:r>
+      </w:hyperlink>
+      <w:r>
+        <w:t>) predicting average pupil size synchrony (</w:t>
+      </w:r>
+      <w:r>
+        <w:rPr>
+          <w:i/>
+          <w:iCs/>
+        </w:rPr>
+        <w:t>z</w:t>
+      </w:r>
+      <w:r>
+        <w:t>-scored) from condition, with a by-participant random intercept, revealed a significant main effect of condition on pupil size synchrony [</w:t>
+      </w:r>
+      <w:r>
+        <w:rPr>
+          <w:i/>
+          <w:iCs/>
+        </w:rPr>
+        <w:t>F</w:t>
+      </w:r>
+      <w:r>
+        <w:t xml:space="preserve">(2, 246)=26.66, </w:t>
+      </w:r>
+      <w:r>
+        <w:rPr>
+          <w:i/>
+          <w:iCs/>
+        </w:rPr>
+        <w:t>p</w:t>
+      </w:r>
+      <w:r>
+        <w:t xml:space="preserve">&lt;0.001]. Follow-up pairwise comparisons using Tukey’s HSD correction indicated that there were statistically significant differences between all condition pairs. Pupil size synchrony was higher in the atypical variation condition (ΔM=0.20, </w:t>
+      </w:r>
+      <w:r>
+        <w:rPr>
+          <w:i/>
+          <w:iCs/>
+        </w:rPr>
+        <w:t>p</w:t>
+      </w:r>
+      <w:r>
+        <w:t xml:space="preserve">=0.006, Cohen’s </w:t>
+      </w:r>
+      <w:r>
+        <w:rPr>
+          <w:i/>
+          <w:iCs/>
+        </w:rPr>
+        <w:t>d</w:t>
+      </w:r>
+      <w:r>
+        <w:t xml:space="preserve">=0.45) and the typical variation condition (ΔM=0.47, </w:t>
+      </w:r>
+      <w:r>
+        <w:rPr>
+          <w:i/>
+          <w:iCs/>
+        </w:rPr>
+        <w:t>p</w:t>
+      </w:r>
+      <w:r>
+        <w:t xml:space="preserve">&lt;0.001, Cohen’s </w:t>
+      </w:r>
+      <w:r>
+        <w:rPr>
+          <w:i/>
+          <w:iCs/>
+        </w:rPr>
+        <w:t>d</w:t>
+      </w:r>
+      <w:r>
+        <w:t xml:space="preserve">=1.07) relative to the consistent condition. Pupil size synchrony was also higher in the typical variation condition relative to the atypical variation condition (ΔM=0.27, </w:t>
+      </w:r>
+      <w:r>
+        <w:rPr>
+          <w:i/>
+          <w:iCs/>
+        </w:rPr>
+        <w:t>p</w:t>
+      </w:r>
+      <w:r>
+        <w:t xml:space="preserve">&lt;0.001, Cohen’s </w:t>
+      </w:r>
+      <w:r>
+        <w:rPr>
+          <w:i/>
+          <w:iCs/>
+        </w:rPr>
+        <w:t>d</w:t>
+      </w:r>
+      <w:r>
+        <w:t>=0.62).</w:t>
+      </w:r>
+    </w:p>
+    <w:p>
+      <w:pPr>
+        <w:pStyle w:val="CaptionedFigure"/>
+      </w:pPr>
+      <w:r>
+        <w:rPr>
+          <w:noProof/>
+        </w:rPr>
+        <w:lastRenderedPageBreak/>
+        <w:drawing>
+          <wp:inline distT="0" distB="0" distL="0" distR="0" wp14:anchorId="79FBCA43" wp14:editId="4B8B7888">
+            <wp:extent cx="5943600" cy="3714749"/>
+            <wp:effectExtent l="0" t="0" r="0" b="0"/>
+            <wp:docPr id="54" name="Picture" descr="Figure 2. Model-predicted mean pupil size synchrony (z-scored) across conditions with 95% confidence intervals. Jittered points represent participant means."/>
+            <wp:cNvGraphicFramePr/>
+            <a:graphic xmlns:a="http://schemas.openxmlformats.org/drawingml/2006/main">
+              <a:graphicData uri="http://schemas.openxmlformats.org/drawingml/2006/picture">
+                <pic:pic xmlns:pic="http://schemas.openxmlformats.org/drawingml/2006/picture">
+                  <pic:nvPicPr>
+                    <pic:cNvPr id="55" name="Picture" descr="Figure2.png"/>
+                    <pic:cNvPicPr>
+                      <a:picLocks noChangeAspect="1" noChangeArrowheads="1"/>
+                    </pic:cNvPicPr>
+                  </pic:nvPicPr>
+                  <pic:blipFill>
+                    <a:blip r:embed="rId16"/>
+                    <a:stretch>
+                      <a:fillRect/>
+                    </a:stretch>
+                  </pic:blipFill>
+                  <pic:spPr bwMode="auto">
+                    <a:xfrm>
+                      <a:off x="0" y="0"/>
+                      <a:ext cx="5943600" cy="3714749"/>
+                    </a:xfrm>
+                    <a:prstGeom prst="rect">
+                      <a:avLst/>
+                    </a:prstGeom>
+                    <a:noFill/>
+                    <a:ln w="9525">
+                      <a:noFill/>
+                      <a:headEnd/>
+                      <a:tailEnd/>
+                    </a:ln>
+                  </pic:spPr>
+                </pic:pic>
+              </a:graphicData>
+            </a:graphic>
+          </wp:inline>
+        </w:drawing>
+      </w:r>
+    </w:p>
+    <w:p>
+      <w:pPr>
+        <w:pStyle w:val="ImageCaption"/>
+      </w:pPr>
+      <w:r>
         <w:t>Figure 2. Model-predicted mean pupil size synchrony (z-scored) across conditions with 95% confidence intervals. Jittered points represent participant means.</w:t>
       </w:r>
     </w:p>
@@ -3485,7 +3517,7 @@
       <w:r>
         <w:t xml:space="preserve">(1), 1–48. </w:t>
       </w:r>
-      <w:hyperlink r:id="rId16">
+      <w:hyperlink r:id="rId17">
         <w:r>
           <w:rPr>
             <w:rStyle w:val="Hyperlink"/>
@@ -3513,7 +3545,7 @@
       <w:r>
         <w:t xml:space="preserve"> [Computer software]. </w:t>
       </w:r>
-      <w:hyperlink r:id="rId17">
+      <w:hyperlink r:id="rId18">
         <w:r>
           <w:rPr>
             <w:rStyle w:val="Hyperlink"/>
@@ -3551,7 +3583,7 @@
       <w:r>
         <w:t xml:space="preserve">, 52–67. </w:t>
       </w:r>
-      <w:hyperlink r:id="rId18">
+      <w:hyperlink r:id="rId19">
         <w:r>
           <w:rPr>
             <w:rStyle w:val="Hyperlink"/>
@@ -3589,7 +3621,7 @@
       <w:r>
         <w:t xml:space="preserve">(1), 107–161. </w:t>
       </w:r>
-      <w:hyperlink r:id="rId19">
+      <w:hyperlink r:id="rId20">
         <w:r>
           <w:rPr>
             <w:rStyle w:val="Hyperlink"/>
@@ -3627,7 +3659,7 @@
       <w:r>
         <w:t xml:space="preserve">(5), 746. </w:t>
       </w:r>
-      <w:hyperlink r:id="rId20">
+      <w:hyperlink r:id="rId21">
         <w:r>
           <w:rPr>
             <w:rStyle w:val="Hyperlink"/>
@@ -3665,7 +3697,7 @@
       <w:r>
         <w:t xml:space="preserve">(1), 11–14. </w:t>
       </w:r>
-      <w:hyperlink r:id="rId21">
+      <w:hyperlink r:id="rId22">
         <w:r>
           <w:rPr>
             <w:rStyle w:val="Hyperlink"/>
@@ -3703,7 +3735,7 @@
       <w:r>
         <w:t xml:space="preserve">. </w:t>
       </w:r>
-      <w:hyperlink r:id="rId22">
+      <w:hyperlink r:id="rId23">
         <w:r>
           <w:rPr>
             <w:rStyle w:val="Hyperlink"/>
@@ -3741,7 +3773,7 @@
       <w:r>
         <w:t xml:space="preserve">(2), 317–335. </w:t>
       </w:r>
-      <w:hyperlink r:id="rId23">
+      <w:hyperlink r:id="rId24">
         <w:r>
           <w:rPr>
             <w:rStyle w:val="Hyperlink"/>
@@ -3780,7 +3812,7 @@
       <w:r>
         <w:t xml:space="preserve">(3), 787–804. </w:t>
       </w:r>
-      <w:hyperlink r:id="rId24">
+      <w:hyperlink r:id="rId25">
         <w:r>
           <w:rPr>
             <w:rStyle w:val="Hyperlink"/>
@@ -3818,7 +3850,7 @@
       <w:r>
         <w:t xml:space="preserve">(4), 1149–1160. </w:t>
       </w:r>
-      <w:hyperlink r:id="rId25">
+      <w:hyperlink r:id="rId26">
         <w:r>
           <w:rPr>
             <w:rStyle w:val="Hyperlink"/>
@@ -3856,7 +3888,7 @@
       <w:r>
         <w:t xml:space="preserve">(6), 103–114. </w:t>
       </w:r>
-      <w:hyperlink r:id="rId26">
+      <w:hyperlink r:id="rId27">
         <w:r>
           <w:rPr>
             <w:rStyle w:val="Hyperlink"/>
@@ -3884,7 +3916,7 @@
       <w:r>
         <w:t xml:space="preserve"> (pp. 97–135). John Benjamins Publishing Company. </w:t>
       </w:r>
-      <w:hyperlink r:id="rId27">
+      <w:hyperlink r:id="rId28">
         <w:r>
           <w:rPr>
             <w:rStyle w:val="Hyperlink"/>
@@ -3912,7 +3944,7 @@
       <w:r>
         <w:t xml:space="preserve">. MIT Press. </w:t>
       </w:r>
-      <w:hyperlink r:id="rId28">
+      <w:hyperlink r:id="rId29">
         <w:r>
           <w:rPr>
             <w:rStyle w:val="Hyperlink"/>
@@ -3950,7 +3982,7 @@
       <w:r>
         <w:t xml:space="preserve">. </w:t>
       </w:r>
-      <w:hyperlink r:id="rId29">
+      <w:hyperlink r:id="rId30">
         <w:r>
           <w:rPr>
             <w:rStyle w:val="Hyperlink"/>
@@ -3978,7 +4010,7 @@
       <w:r>
         <w:t xml:space="preserve">. </w:t>
       </w:r>
-      <w:hyperlink r:id="rId30">
+      <w:hyperlink r:id="rId31">
         <w:r>
           <w:rPr>
             <w:rStyle w:val="Hyperlink"/>
@@ -4017,7 +4049,7 @@
       <w:r>
         <w:t xml:space="preserve">(4), 762–773. </w:t>
       </w:r>
-      <w:hyperlink r:id="rId31">
+      <w:hyperlink r:id="rId32">
         <w:r>
           <w:rPr>
             <w:rStyle w:val="Hyperlink"/>
@@ -4075,7 +4107,7 @@
       <w:r>
         <w:t xml:space="preserve">(5), e36399. </w:t>
       </w:r>
-      <w:hyperlink r:id="rId32">
+      <w:hyperlink r:id="rId33">
         <w:r>
           <w:rPr>
             <w:rStyle w:val="Hyperlink"/>
@@ -4113,7 +4145,7 @@
       <w:r>
         <w:t xml:space="preserve">(5), 1795–1804. </w:t>
       </w:r>
-      <w:hyperlink r:id="rId33">
+      <w:hyperlink r:id="rId34">
         <w:r>
           <w:rPr>
             <w:rStyle w:val="Hyperlink"/>
@@ -4151,7 +4183,7 @@
       <w:r>
         <w:t xml:space="preserve">, 32–45. </w:t>
       </w:r>
-      <w:hyperlink r:id="rId34">
+      <w:hyperlink r:id="rId35">
         <w:r>
           <w:rPr>
             <w:rStyle w:val="Hyperlink"/>
@@ -4189,7 +4221,7 @@
       <w:r>
         <w:t xml:space="preserve">(2), 173–187. </w:t>
       </w:r>
-      <w:hyperlink r:id="rId35">
+      <w:hyperlink r:id="rId36">
         <w:r>
           <w:rPr>
             <w:rStyle w:val="Hyperlink"/>
@@ -4227,7 +4259,7 @@
       <w:r>
         <w:t xml:space="preserve">(4), 1024–1044. </w:t>
       </w:r>
-      <w:hyperlink r:id="rId36">
+      <w:hyperlink r:id="rId37">
         <w:r>
           <w:rPr>
             <w:rStyle w:val="Hyperlink"/>
@@ -4266,7 +4298,7 @@
       <w:r>
         <w:t xml:space="preserve">(1), 24–52. </w:t>
       </w:r>
-      <w:hyperlink r:id="rId37">
+      <w:hyperlink r:id="rId38">
         <w:r>
           <w:rPr>
             <w:rStyle w:val="Hyperlink"/>
@@ -4304,7 +4336,7 @@
       <w:r>
         <w:t xml:space="preserve">(2), 121–157. </w:t>
       </w:r>
-      <w:hyperlink r:id="rId38">
+      <w:hyperlink r:id="rId39">
         <w:r>
           <w:rPr>
             <w:rStyle w:val="Hyperlink"/>
@@ -4342,7 +4374,7 @@
       <w:r>
         <w:t xml:space="preserve">(3), 241–275. </w:t>
       </w:r>
-      <w:hyperlink r:id="rId39">
+      <w:hyperlink r:id="rId40">
         <w:r>
           <w:rPr>
             <w:rStyle w:val="Hyperlink"/>
@@ -4370,7 +4402,7 @@
       <w:r>
         <w:t xml:space="preserve"> (pp. 39–58). Springer. </w:t>
       </w:r>
-      <w:hyperlink r:id="rId40">
+      <w:hyperlink r:id="rId41">
         <w:r>
           <w:rPr>
             <w:rStyle w:val="Hyperlink"/>
@@ -4408,7 +4440,7 @@
       <w:r>
         <w:t xml:space="preserve">. </w:t>
       </w:r>
-      <w:hyperlink r:id="rId41">
+      <w:hyperlink r:id="rId42">
         <w:r>
           <w:rPr>
             <w:rStyle w:val="Hyperlink"/>
@@ -4446,7 +4478,7 @@
       <w:r>
         <w:t xml:space="preserve">(1), 56–59. </w:t>
       </w:r>
-      <w:hyperlink r:id="rId42">
+      <w:hyperlink r:id="rId43">
         <w:r>
           <w:rPr>
             <w:rStyle w:val="Hyperlink"/>
@@ -4484,7 +4516,7 @@
       <w:r>
         <w:t xml:space="preserve">(4), 1163–1177. </w:t>
       </w:r>
-      <w:hyperlink r:id="rId43">
+      <w:hyperlink r:id="rId44">
         <w:r>
           <w:rPr>
             <w:rStyle w:val="Hyperlink"/>
@@ -4523,7 +4555,7 @@
       <w:r>
         <w:t xml:space="preserve">, 84–93. </w:t>
       </w:r>
-      <w:hyperlink r:id="rId44">
+      <w:hyperlink r:id="rId45">
         <w:r>
           <w:rPr>
             <w:rStyle w:val="Hyperlink"/>
@@ -4561,7 +4593,7 @@
       <w:r>
         <w:t xml:space="preserve">, 105694. </w:t>
       </w:r>
-      <w:hyperlink r:id="rId45">
+      <w:hyperlink r:id="rId46">
         <w:r>
           <w:rPr>
             <w:rStyle w:val="Hyperlink"/>
@@ -4599,7 +4631,7 @@
       <w:r>
         <w:t xml:space="preserve">(1), e12997. </w:t>
       </w:r>
-      <w:hyperlink r:id="rId46">
+      <w:hyperlink r:id="rId47">
         <w:r>
           <w:rPr>
             <w:rStyle w:val="Hyperlink"/>
@@ -4637,7 +4669,7 @@
       <w:r>
         <w:t xml:space="preserve">(6), 1974–1999. </w:t>
       </w:r>
-      <w:hyperlink r:id="rId47">
+      <w:hyperlink r:id="rId48">
         <w:r>
           <w:rPr>
             <w:rStyle w:val="Hyperlink"/>
@@ -4675,7 +4707,7 @@
       <w:r>
         <w:t xml:space="preserve">(4), 380–397. </w:t>
       </w:r>
-      <w:hyperlink r:id="rId48">
+      <w:hyperlink r:id="rId49">
         <w:r>
           <w:rPr>
             <w:rStyle w:val="Hyperlink"/>
@@ -4713,7 +4745,7 @@
       <w:r>
         <w:t xml:space="preserve">(1), 204–218. </w:t>
       </w:r>
-      <w:hyperlink r:id="rId49">
+      <w:hyperlink r:id="rId50">
         <w:r>
           <w:rPr>
             <w:rStyle w:val="Hyperlink"/>
@@ -4751,7 +4783,7 @@
       <w:r>
         <w:t xml:space="preserve">(1), 1. </w:t>
       </w:r>
-      <w:hyperlink r:id="rId50">
+      <w:hyperlink r:id="rId51">
         <w:r>
           <w:rPr>
             <w:rStyle w:val="Hyperlink"/>
@@ -4789,7 +4821,7 @@
       <w:r>
         <w:t xml:space="preserve">(6), 1478–1488. </w:t>
       </w:r>
-      <w:hyperlink r:id="rId51">
+      <w:hyperlink r:id="rId52">
         <w:r>
           <w:rPr>
             <w:rStyle w:val="Hyperlink"/>
@@ -4828,7 +4860,7 @@
       <w:r>
         <w:t xml:space="preserve">(1), 85–100. </w:t>
       </w:r>
-      <w:hyperlink r:id="rId52">
+      <w:hyperlink r:id="rId53">
         <w:r>
           <w:rPr>
             <w:rStyle w:val="Hyperlink"/>
@@ -4866,7 +4898,7 @@
       <w:r>
         <w:t xml:space="preserve">(3-4), 256–276. </w:t>
       </w:r>
-      <w:hyperlink r:id="rId53">
+      <w:hyperlink r:id="rId54">
         <w:r>
           <w:rPr>
             <w:rStyle w:val="Hyperlink"/>
@@ -4904,7 +4936,7 @@
       <w:r>
         <w:t xml:space="preserve">, 193–206. </w:t>
       </w:r>
-      <w:hyperlink r:id="rId54">
+      <w:hyperlink r:id="rId55">
         <w:r>
           <w:rPr>
             <w:rStyle w:val="Hyperlink"/>
@@ -4942,7 +4974,7 @@
       <w:r>
         <w:t xml:space="preserve">(6), 819–865. </w:t>
       </w:r>
-      <w:hyperlink r:id="rId55">
+      <w:hyperlink r:id="rId56">
         <w:r>
           <w:rPr>
             <w:rStyle w:val="Hyperlink"/>
@@ -4980,7 +5012,7 @@
       <w:r>
         <w:t xml:space="preserve">(8), 1656. </w:t>
       </w:r>
-      <w:hyperlink r:id="rId56">
+      <w:hyperlink r:id="rId57">
         <w:r>
           <w:rPr>
             <w:rStyle w:val="Hyperlink"/>
@@ -5018,7 +5050,7 @@
       <w:r>
         <w:t xml:space="preserve">(3), 191–244. </w:t>
       </w:r>
-      <w:hyperlink r:id="rId57">
+      <w:hyperlink r:id="rId58">
         <w:r>
           <w:rPr>
             <w:rStyle w:val="Hyperlink"/>
@@ -5046,7 +5078,7 @@
       <w:r>
         <w:t xml:space="preserve"> (Version 5.3.15) [Computer software]. Savage Interactive Pty Ltd. </w:t>
       </w:r>
-      <w:hyperlink r:id="rId58">
+      <w:hyperlink r:id="rId59">
         <w:r>
           <w:rPr>
             <w:rStyle w:val="Hyperlink"/>
@@ -5105,7 +5137,7 @@
       <w:r>
         <w:t xml:space="preserve">(6), 879. </w:t>
       </w:r>
-      <w:hyperlink r:id="rId59">
+      <w:hyperlink r:id="rId60">
         <w:r>
           <w:rPr>
             <w:rStyle w:val="Hyperlink"/>
@@ -5143,7 +5175,7 @@
       <w:r>
         <w:t xml:space="preserve">(3), 339–351. </w:t>
       </w:r>
-      <w:hyperlink r:id="rId60">
+      <w:hyperlink r:id="rId61">
         <w:r>
           <w:rPr>
             <w:rStyle w:val="Hyperlink"/>
@@ -5181,7 +5213,7 @@
       <w:r>
         <w:t xml:space="preserve">(3), 1558–1568. </w:t>
       </w:r>
-      <w:hyperlink r:id="rId61">
+      <w:hyperlink r:id="rId62">
         <w:r>
           <w:rPr>
             <w:rStyle w:val="Hyperlink"/>
@@ -5219,7 +5251,7 @@
       <w:r>
         <w:t xml:space="preserve">(4), 501–532. </w:t>
       </w:r>
-      <w:hyperlink r:id="rId62">
+      <w:hyperlink r:id="rId63">
         <w:r>
           <w:rPr>
             <w:rStyle w:val="Hyperlink"/>
@@ -5257,7 +5289,7 @@
       <w:r>
         <w:t xml:space="preserve">, 638–676. </w:t>
       </w:r>
-      <w:hyperlink r:id="rId63">
+      <w:hyperlink r:id="rId64">
         <w:r>
           <w:rPr>
             <w:rStyle w:val="Hyperlink"/>
@@ -5285,7 +5317,7 @@
       <w:r>
         <w:t xml:space="preserve">, 29–42. </w:t>
       </w:r>
-      <w:hyperlink r:id="rId64">
+      <w:hyperlink r:id="rId65">
         <w:r>
           <w:rPr>
             <w:rStyle w:val="Hyperlink"/>
@@ -5323,7 +5355,7 @@
       <w:r>
         <w:t xml:space="preserve">(7), 1011. </w:t>
       </w:r>
-      <w:hyperlink r:id="rId65">
+      <w:hyperlink r:id="rId66">
         <w:r>
           <w:rPr>
             <w:rStyle w:val="Hyperlink"/>
@@ -5361,7 +5393,7 @@
       <w:r>
         <w:t xml:space="preserve">(2), 147–166. </w:t>
       </w:r>
-      <w:hyperlink r:id="rId66">
+      <w:hyperlink r:id="rId67">
         <w:r>
           <w:rPr>
             <w:rStyle w:val="Hyperlink"/>
@@ -5399,7 +5431,7 @@
       <w:r>
         <w:t xml:space="preserve">(2), 99–132. </w:t>
       </w:r>
-      <w:hyperlink r:id="rId67">
+      <w:hyperlink r:id="rId68">
         <w:r>
           <w:rPr>
             <w:rStyle w:val="Hyperlink"/>
@@ -5438,7 +5470,7 @@
       <w:r>
         <w:t xml:space="preserve">(4), 929. </w:t>
       </w:r>
-      <w:hyperlink r:id="rId68">
+      <w:hyperlink r:id="rId69">
         <w:r>
           <w:rPr>
             <w:rStyle w:val="Hyperlink"/>
@@ -5496,7 +5528,7 @@
       <w:r>
         <w:t xml:space="preserve">(1), 11–34. </w:t>
       </w:r>
-      <w:hyperlink r:id="rId69">
+      <w:hyperlink r:id="rId70">
         <w:r>
           <w:rPr>
             <w:rStyle w:val="Hyperlink"/>
@@ -5534,7 +5566,7 @@
       <w:r>
         <w:t xml:space="preserve">(3), 159–165. </w:t>
       </w:r>
-      <w:hyperlink r:id="rId70">
+      <w:hyperlink r:id="rId71">
         <w:r>
           <w:rPr>
             <w:rStyle w:val="Hyperlink"/>
@@ -5572,7 +5604,7 @@
       <w:r>
         <w:t xml:space="preserve">(4), e1596. </w:t>
       </w:r>
-      <w:hyperlink r:id="rId71">
+      <w:hyperlink r:id="rId72">
         <w:r>
           <w:rPr>
             <w:rStyle w:val="Hyperlink"/>
@@ -5610,7 +5642,7 @@
       <w:r>
         <w:t xml:space="preserve">, 374. </w:t>
       </w:r>
-      <w:hyperlink r:id="rId72">
+      <w:hyperlink r:id="rId73">
         <w:r>
           <w:rPr>
             <w:rStyle w:val="Hyperlink"/>
@@ -5623,12 +5655,12 @@
       <w:bookmarkEnd w:id="81"/>
     </w:p>
     <w:sectPr>
-      <w:headerReference w:type="even" r:id="rId73"/>
-      <w:headerReference w:type="default" r:id="rId74"/>
-      <w:footerReference w:type="even" r:id="rId75"/>
-      <w:footerReference w:type="default" r:id="rId76"/>
-      <w:headerReference w:type="first" r:id="rId77"/>
-      <w:footerReference w:type="first" r:id="rId78"/>
+      <w:headerReference w:type="even" r:id="rId74"/>
+      <w:headerReference w:type="default" r:id="rId75"/>
+      <w:footerReference w:type="even" r:id="rId76"/>
+      <w:footerReference w:type="default" r:id="rId77"/>
+      <w:headerReference w:type="first" r:id="rId78"/>
+      <w:footerReference w:type="first" r:id="rId79"/>
       <w:pgSz w:w="12240" w:h="15840"/>
       <w:pgMar w:top="1440" w:right="1440" w:bottom="1440" w:left="1440" w:header="720" w:footer="720" w:gutter="0"/>
       <w:cols w:space="720"/>
@@ -6065,7 +6097,7 @@
   <w:abstractNum w:abstractNumId="10" w15:restartNumberingAfterBreak="0">
     <w:nsid w:val="0000A990"/>
     <w:multiLevelType w:val="multilevel"/>
-    <w:tmpl w:val="7916CFC8"/>
+    <w:tmpl w:val="77346E4E"/>
     <w:lvl w:ilvl="0">
       <w:numFmt w:val="bullet"/>
       <w:lvlText w:val=" "/>
@@ -6142,7 +6174,7 @@
   <w:abstractNum w:abstractNumId="11" w15:restartNumberingAfterBreak="0">
     <w:nsid w:val="0000A991"/>
     <w:multiLevelType w:val="multilevel"/>
-    <w:tmpl w:val="8F24CA8C"/>
+    <w:tmpl w:val="065C62E2"/>
     <w:lvl w:ilvl="0">
       <w:numFmt w:val="bullet"/>
       <w:lvlText w:val="•"/>
@@ -6369,10 +6401,10 @@
   <w:num w:numId="21" w16cid:durableId="2107966237">
     <w:abstractNumId w:val="0"/>
   </w:num>
-  <w:num w:numId="22" w16cid:durableId="793596661">
+  <w:num w:numId="22" w16cid:durableId="533227031">
     <w:abstractNumId w:val="10"/>
   </w:num>
-  <w:num w:numId="23" w16cid:durableId="1057705879">
+  <w:num w:numId="23" w16cid:durableId="1632205360">
     <w:abstractNumId w:val="11"/>
   </w:num>
 </w:numbering>
@@ -7862,6 +7894,17 @@
       <w:szCs w:val="20"/>
     </w:rPr>
   </w:style>
+  <w:style w:type="character" w:styleId="FollowedHyperlink">
+    <w:name w:val="FollowedHyperlink"/>
+    <w:basedOn w:val="DefaultParagraphFont"/>
+    <w:semiHidden/>
+    <w:unhideWhenUsed/>
+    <w:rsid w:val="00F04F2C"/>
+    <w:rPr>
+      <w:color w:val="954F72" w:themeColor="followedHyperlink"/>
+      <w:u w:val="single"/>
+    </w:rPr>
+  </w:style>
 </w:styles>
 </file>
 

</xml_diff>